<commit_message>
fix(genre): render docx tables as aligned monospace blocks, simplify experience-dataset CSV
Co-Authored-By: Claude Sonnet 5 <noreply@anthropic.com>
</commit_message>
<xml_diff>
--- a/assets/demo/sample-legacy-model.docx
+++ b/assets/demo/sample-legacy-model.docx
@@ -190,7 +190,7 @@
           <w:sz-cs w:val="24"/>
           <w:spacing w:val="0"/>
         </w:rPr>
-        <w:t xml:space="preserve">• </w:t>
+        <w:t xml:space="preserve">• </w:t>
       </w:r>
       <w:r>
         <w:rPr>
@@ -295,7 +295,7 @@
           <w:sz-cs w:val="24"/>
           <w:spacing w:val="0"/>
         </w:rPr>
-        <w:t xml:space="preserve">• </w:t>
+        <w:t xml:space="preserve">• </w:t>
       </w:r>
       <w:r>
         <w:rPr>
@@ -328,7 +328,7 @@
           <w:sz-cs w:val="24"/>
           <w:spacing w:val="0"/>
         </w:rPr>
-        <w:t xml:space="preserve">• </w:t>
+        <w:t xml:space="preserve">• </w:t>
       </w:r>
       <w:r>
         <w:rPr>

</xml_diff>